<commit_message>
Avances y correciones con docu M2
</commit_message>
<xml_diff>
--- a/Documentación del Sistema/Documentación/Informe_Modificaciones_Diagramas_Fase2.docx
+++ b/Documentación del Sistema/Documentación/Informe_Modificaciones_Diagramas_Fase2.docx
@@ -45,6 +45,14 @@
         <w:gridCol w:w="4680"/>
       </w:tblGrid>
       <w:tr>
+        <w:trPr>
+          <w:tblHeader w:val="true"/>
+          <w:cantSplit/>
+          <w:tblHeader w:val="true"/>
+          <w:cantSplit/>
+          <w:tblHeader w:val="true"/>
+          <w:cantSplit/>
+        </w:trPr>
         <w:tc>
           <w:tcPr>
             <w:tcW w:type="dxa" w:w="2880"/>
@@ -86,6 +94,11 @@
         </w:tc>
       </w:tr>
       <w:tr>
+        <w:trPr>
+          <w:cantSplit/>
+          <w:cantSplit/>
+          <w:cantSplit/>
+        </w:trPr>
         <w:tc>
           <w:tcPr>
             <w:tcW w:type="dxa" w:w="2880"/>
@@ -127,6 +140,11 @@
         </w:tc>
       </w:tr>
       <w:tr>
+        <w:trPr>
+          <w:cantSplit/>
+          <w:cantSplit/>
+          <w:cantSplit/>
+        </w:trPr>
         <w:tc>
           <w:tcPr>
             <w:tcW w:type="dxa" w:w="2880"/>
@@ -168,6 +186,11 @@
         </w:tc>
       </w:tr>
       <w:tr>
+        <w:trPr>
+          <w:cantSplit/>
+          <w:cantSplit/>
+          <w:cantSplit/>
+        </w:trPr>
         <w:tc>
           <w:tcPr>
             <w:tcW w:type="dxa" w:w="2880"/>
@@ -248,13 +271,7 @@
         <w:spacing w:before="0" w:after="100" w:line="276" w:lineRule="auto"/>
       </w:pPr>
       <w:r>
-        <w:rPr>
-          <w:rFonts w:ascii="Calibri" w:hAnsi="Calibri"/>
-          <w:i w:val="0"/>
-          <w:color w:val="2D3748"/>
-          <w:sz w:val="22"/>
-        </w:rPr>
-        <w:t>Bajo el modelo de proceso adoptado por la cátedra —el Ciclo de Vida Incremental e Iterativo—, cada incremento del sistema atraviesa una fase rigurosa de análisis de requerimientos en profundidad previa a su codificación definitiva. Durante la especificación formal y el análisis detallado de los Requerimientos Funcionales del Módulo 2 (RF-10 a RF-18, correspondientes a la atención automatizada vía WhatsApp, recepción inteligente de comprobantes y gestión preventiva de cobros), el equipo de desarrollo detectó que el modelado preliminar concebido en la Fase 1 presentaba vacíos semánticos y omisiones estructurales que no permitían soportar con fidelidad la operativa real de negocio.</w:t>
+        <w:t>Bajo el ciclo de vida incremental e iterativo adoptado por la cátedra, revisamos los requerimientos antes de consolidar cada incremento. Para el Módulo 2, el informe del sistema define RF-10 a RF-18 para recepción de mensajes, reconocimiento de intención, identificación, consulta de cuenta, reclamos, atención humana, historial, cierre y avisos de vencimiento. La recepción de comprobantes está definida por separado en RF-19.</w:t>
       </w:r>
     </w:p>
     <w:p>
@@ -292,13 +309,7 @@
         <w:spacing w:before="240" w:after="80"/>
       </w:pPr>
       <w:r>
-        <w:rPr>
-          <w:rFonts w:ascii="Calibri" w:hAnsi="Calibri"/>
-          <w:b/>
-          <w:color w:val="2B6CB0"/>
-          <w:sz w:val="25"/>
-        </w:rPr>
-        <w:t>2.1. Canalización y Persistencia de Avisos Preventivos de Vencimiento (RF-17 y RF-18)</w:t>
+        <w:t>2.1. Canalización y Persistencia de Avisos de Vencimiento (RF-18)</w:t>
       </w:r>
     </w:p>
     <w:p>
@@ -320,22 +331,7 @@
         <w:spacing w:before="0" w:after="100" w:line="276" w:lineRule="auto"/>
       </w:pPr>
       <w:r>
-        <w:rPr>
-          <w:rFonts w:ascii="Calibri" w:hAnsi="Calibri"/>
-          <w:b/>
-          <w:color w:val="2D3748"/>
-          <w:sz w:val="22"/>
-        </w:rPr>
-        <w:t xml:space="preserve">Hallazgo de Requerimiento: </w:t>
-      </w:r>
-      <w:r>
-        <w:rPr>
-          <w:rFonts w:ascii="Calibri" w:hAnsi="Calibri"/>
-          <w:i w:val="0"/>
-          <w:color w:val="2D3748"/>
-          <w:sz w:val="22"/>
-        </w:rPr>
-        <w:t>Sin embargo, al especificar en detalle los requerimientos RF-17 (envío automatizado de aviso previo al vencimiento) y RF-18 (notificación de deuda vencida), se evidenció que un aviso no es un simple texto, sino un evento de negocio con auditoría propia que requiere:</w:t>
+        <w:t>Hallazgo de Requerimiento: RF-18 solicita notificar por WhatsApp cuando un servicio esté próximo a vencer o ya vencido. Para conservar trazabilidad del proceso, se modeló cada aviso como un evento con estado de envío, intento y posible error:</w:t>
       </w:r>
     </w:p>
     <w:p>
@@ -350,7 +346,6 @@
           <w:color w:val="2D3748"/>
           <w:sz w:val="21"/>
         </w:rPr>
-        <w:t xml:space="preserve">• </w:t>
       </w:r>
       <w:r>
         <w:rPr>
@@ -373,7 +368,6 @@
           <w:color w:val="2D3748"/>
           <w:sz w:val="21"/>
         </w:rPr>
-        <w:t xml:space="preserve">• </w:t>
       </w:r>
       <w:r>
         <w:rPr>
@@ -396,7 +390,6 @@
           <w:color w:val="2D3748"/>
           <w:sz w:val="21"/>
         </w:rPr>
-        <w:t xml:space="preserve">• </w:t>
       </w:r>
       <w:r>
         <w:rPr>
@@ -413,21 +406,7 @@
         <w:spacing w:before="0" w:after="60" w:line="276" w:lineRule="auto"/>
       </w:pPr>
       <w:r>
-        <w:rPr>
-          <w:rFonts w:ascii="Calibri" w:hAnsi="Calibri"/>
-          <w:b/>
-          <w:color w:val="2D3748"/>
-          <w:sz w:val="21"/>
-        </w:rPr>
-        <w:t xml:space="preserve">• </w:t>
-      </w:r>
-      <w:r>
-        <w:rPr>
-          <w:rFonts w:ascii="Calibri" w:hAnsi="Calibri"/>
-          <w:color w:val="2D3748"/>
-          <w:sz w:val="21"/>
-        </w:rPr>
-        <w:t>Restricción estricta de unicidad compuesta [id_cuota, tipo] para garantizar que una cuota no reciba notificaciones duplicadas en el mismo período, previniendo spam involuntario al cliente.</w:t>
+        <w:t>Unicidad compuesta [id_cuota, tipo] para conservar un registro por clase de aviso y cuota. Los intentos fallidos pueden reintentarse sobre el mismo registro.</w:t>
       </w:r>
     </w:p>
     <w:p>
@@ -459,13 +438,7 @@
         <w:spacing w:before="240" w:after="80"/>
       </w:pPr>
       <w:r>
-        <w:rPr>
-          <w:rFonts w:ascii="Calibri" w:hAnsi="Calibri"/>
-          <w:b/>
-          <w:color w:val="2B6CB0"/>
-          <w:sz w:val="25"/>
-        </w:rPr>
-        <w:t>2.2. Desacoplamiento de Cliente e Identificación Dinámica en el Chatbot (RF-10, RF-11, RF-12)</w:t>
+        <w:t>2.2. Identificación del Cliente y Alta desde WhatsApp (RF-10 y RF-12)</w:t>
       </w:r>
     </w:p>
     <w:p>
@@ -534,21 +507,7 @@
         <w:spacing w:before="0" w:after="60" w:line="276" w:lineRule="auto"/>
       </w:pPr>
       <w:r>
-        <w:rPr>
-          <w:rFonts w:ascii="Calibri" w:hAnsi="Calibri"/>
-          <w:b/>
-          <w:color w:val="2D3748"/>
-          <w:sz w:val="21"/>
-        </w:rPr>
-        <w:t xml:space="preserve">2. </w:t>
-      </w:r>
-      <w:r>
-        <w:rPr>
-          <w:rFonts w:ascii="Calibri" w:hAnsi="Calibri"/>
-          <w:color w:val="2D3748"/>
-          <w:sz w:val="21"/>
-        </w:rPr>
-        <w:t>Imposibilidad de atender a clientes ya registrados cuyo número de teléfono no coincidía inicialmente con el registrado en base de datos o que requerían un proceso de identificación guiada por DNI (RF-11).</w:t>
+        <w:t>2. Imposibilidad de identificar por DNI a clientes registrados cuyo número no coincide y de ofrecer desde el chat el alta y la contratación a nuevos clientes (RF-12).</w:t>
       </w:r>
     </w:p>
     <w:p>
@@ -580,13 +539,7 @@
         <w:spacing w:before="240" w:after="80"/>
       </w:pPr>
       <w:r>
-        <w:rPr>
-          <w:rFonts w:ascii="Calibri" w:hAnsi="Calibri"/>
-          <w:b/>
-          <w:color w:val="2B6CB0"/>
-          <w:sz w:val="25"/>
-        </w:rPr>
-        <w:t>2.3. Máquina de Estados del Diálogo y Control de Intentos de Comprensión (RF-13, RF-15)</w:t>
+        <w:t>2.3. Estado del Flujo y Reconocimiento de Intención (RF-11 y RF-15)</w:t>
       </w:r>
     </w:p>
     <w:p>
@@ -608,22 +561,7 @@
         <w:spacing w:before="0" w:after="100" w:line="276" w:lineRule="auto"/>
       </w:pPr>
       <w:r>
-        <w:rPr>
-          <w:rFonts w:ascii="Calibri" w:hAnsi="Calibri"/>
-          <w:b/>
-          <w:color w:val="2D3748"/>
-          <w:sz w:val="22"/>
-        </w:rPr>
-        <w:t xml:space="preserve">Hallazgo de Requerimiento: </w:t>
-      </w:r>
-      <w:r>
-        <w:rPr>
-          <w:rFonts w:ascii="Calibri" w:hAnsi="Calibri"/>
-          <w:i w:val="0"/>
-          <w:color w:val="2D3748"/>
-          <w:sz w:val="22"/>
-        </w:rPr>
-        <w:t>Sin persistencia de estado de flujo, un reinicio del servicio o una nueva solicitud entrante provocaría la pérdida del contexto conversacional (por ejemplo, si el bot estaba esperando la imagen de un comprobante o la descripción de una falla técnica). Asimismo, para cumplir con el escalado automático a personal humano tras dos fallos de intención (RF-15), era indispensable persistir un contador específico de intentos fallidos.</w:t>
+        <w:t>Hallazgo de Requerimiento: RF-11 pide reconocer la intención en lenguaje natural, solicitar reformulación cuando no se comprende y derivar a una persona tras el segundo fallo. La conversación también debe conservar el paso actual del alta o gestión; por eso se persistieron el estado del flujo y el contador de fallos.</w:t>
       </w:r>
     </w:p>
     <w:p>
@@ -655,13 +593,7 @@
         <w:spacing w:before="240" w:after="80"/>
       </w:pPr>
       <w:r>
-        <w:rPr>
-          <w:rFonts w:ascii="Calibri" w:hAnsi="Calibri"/>
-          <w:b/>
-          <w:color w:val="2B6CB0"/>
-          <w:sz w:val="25"/>
-        </w:rPr>
-        <w:t>2.4. Seguridad, Integridad y Prevención de Fraudes en Comprobantes (RF-14)</w:t>
+        <w:t>2.4. Recepción de Comprobantes y Brechas de OCR y Validación (RF-19 a RF-26)</w:t>
       </w:r>
     </w:p>
     <w:p>
@@ -683,22 +615,7 @@
         <w:spacing w:before="0" w:after="100" w:line="276" w:lineRule="auto"/>
       </w:pPr>
       <w:r>
-        <w:rPr>
-          <w:rFonts w:ascii="Calibri" w:hAnsi="Calibri"/>
-          <w:b/>
-          <w:color w:val="2D3748"/>
-          <w:sz w:val="22"/>
-        </w:rPr>
-        <w:t xml:space="preserve">Hallazgo de Requerimiento: </w:t>
-      </w:r>
-      <w:r>
-        <w:rPr>
-          <w:rFonts w:ascii="Calibri" w:hAnsi="Calibri"/>
-          <w:i w:val="0"/>
-          <w:color w:val="2D3748"/>
-          <w:sz w:val="22"/>
-        </w:rPr>
-        <w:t>Para mitigar el riesgo de presentación repetida de un mismo ticket de transferencia bancaria o comprobante de Mercado Pago por parte de distintos usuarios o en fechas diferidas, el análisis de seguridad exigió:</w:t>
+        <w:t>Hallazgo de Requerimiento: El envío de imagen o PDF está definido por RF-19. RF-20 a RF-26 incluyen OCR, reenvío si falla la lectura, detección de duplicados, conciliación, aprobación o rechazo y notificación del resultado. La tabla actual tiene campos previstos para ese trabajo, pero recibir el archivo y dejarlo pendiente no equivale a completar ese flujo.</w:t>
       </w:r>
     </w:p>
     <w:p>
@@ -713,7 +630,6 @@
           <w:color w:val="2D3748"/>
           <w:sz w:val="21"/>
         </w:rPr>
-        <w:t xml:space="preserve">• </w:t>
       </w:r>
       <w:r>
         <w:rPr>
@@ -736,7 +652,6 @@
           <w:color w:val="2D3748"/>
           <w:sz w:val="21"/>
         </w:rPr>
-        <w:t xml:space="preserve">• </w:t>
       </w:r>
       <w:r>
         <w:rPr>
@@ -759,7 +674,6 @@
           <w:color w:val="2D3748"/>
           <w:sz w:val="21"/>
         </w:rPr>
-        <w:t xml:space="preserve">• </w:t>
       </w:r>
       <w:r>
         <w:rPr>
@@ -776,13 +690,7 @@
         <w:spacing w:before="240" w:after="80"/>
       </w:pPr>
       <w:r>
-        <w:rPr>
-          <w:rFonts w:ascii="Calibri" w:hAnsi="Calibri"/>
-          <w:b/>
-          <w:color w:val="2B6CB0"/>
-          <w:sz w:val="25"/>
-        </w:rPr>
-        <w:t>2.5. Simplificación Estructural de Notas Internas en Tickets de Soporte</w:t>
+        <w:t>2.5. Notas Internas de Tickets Pendientes (RF-32)</w:t>
       </w:r>
     </w:p>
     <w:p>
@@ -790,18 +698,13 @@
         <w:spacing w:before="0" w:after="100" w:line="276" w:lineRule="auto"/>
       </w:pPr>
       <w:r>
-        <w:rPr>
-          <w:rFonts w:ascii="Calibri" w:hAnsi="Calibri"/>
-          <w:i w:val="0"/>
-          <w:color w:val="2D3748"/>
-          <w:sz w:val="22"/>
-        </w:rPr>
-        <w:t>Durante la revisión del módulo de tickets y reclamos, se evaluó la entidad preliminar NotaInterna. Se concluyó que, dado el volumen operativo y la naturaleza del flujo de soporte técnico donde el operador interactúa directamente en el hilo de la conversación escalada, la persistencia de notas en una tabla aislada agregaba sobrecarga relacional innecesaria. Se consolidaron las observaciones técnicas directamente en el ciclo de vida del Ticket y en los mensajes auditados del hilo conversacional.</w:t>
+        <w:t>RF-32 solicita que empleados y administradores agreguen notas internas a los tickets. El código vigente todavía no tiene modelo, migración ni flujo para NotaInterna; por eso se quitó del DER lógico como si estuviera persistida, pero se conserva como requerimiento pendiente. El historial de WhatsApp no reemplaza una nota interna del ticket porque tiene otro propósito y audiencia.</w:t>
       </w:r>
     </w:p>
     <w:p>
       <w:pPr>
         <w:keepNext/>
+        <w:pageBreakBefore/>
         <w:spacing w:before="320" w:after="120"/>
       </w:pPr>
       <w:r>
@@ -818,6 +721,7 @@
       <w:tblPr>
         <w:tblW w:type="auto" w:w="0"/>
         <w:jc w:val="center"/>
+        <w:tblLayout w:type="fixed"/>
         <w:tblLook w:firstColumn="1" w:firstRow="1" w:lastColumn="0" w:lastRow="0" w:noHBand="0" w:noVBand="1" w:val="04A0"/>
       </w:tblPr>
       <w:tblGrid>
@@ -827,18 +731,29 @@
         <w:gridCol w:w="2340"/>
       </w:tblGrid>
       <w:tr>
+        <w:trPr>
+          <w:tblHeader w:val="true"/>
+          <w:cantSplit/>
+          <w:tblHeader w:val="true"/>
+          <w:cantSplit/>
+          <w:tblHeader w:val="true"/>
+          <w:cantSplit/>
+        </w:trPr>
         <w:tc>
           <w:tcPr>
-            <w:tcW w:type="dxa" w:w="2340"/>
+            <w:tcW w:type="dxa" w:w="1728"/>
             <w:shd w:fill="1A365D"/>
           </w:tcPr>
           <w:p>
+            <w:pPr>
+              <w:spacing w:after="20"/>
+            </w:pPr>
             <w:r>
               <w:rPr>
                 <w:rFonts w:ascii="Calibri" w:hAnsi="Calibri"/>
                 <w:b/>
                 <w:color w:val="FFFFFF"/>
-                <w:sz w:val="19"/>
+                <w:sz w:val="18"/>
               </w:rPr>
               <w:t>Diagrama</w:t>
             </w:r>
@@ -846,16 +761,19 @@
         </w:tc>
         <w:tc>
           <w:tcPr>
-            <w:tcW w:type="dxa" w:w="2340"/>
+            <w:tcW w:type="dxa" w:w="2232"/>
             <w:shd w:fill="1A365D"/>
           </w:tcPr>
           <w:p>
+            <w:pPr>
+              <w:spacing w:after="20"/>
+            </w:pPr>
             <w:r>
               <w:rPr>
                 <w:rFonts w:ascii="Calibri" w:hAnsi="Calibri"/>
                 <w:b/>
                 <w:color w:val="FFFFFF"/>
-                <w:sz w:val="19"/>
+                <w:sz w:val="18"/>
               </w:rPr>
               <w:t>Elemento Modificado</w:t>
             </w:r>
@@ -863,16 +781,19 @@
         </w:tc>
         <w:tc>
           <w:tcPr>
-            <w:tcW w:type="dxa" w:w="2340"/>
+            <w:tcW w:type="dxa" w:w="1944"/>
             <w:shd w:fill="1A365D"/>
           </w:tcPr>
           <w:p>
+            <w:pPr>
+              <w:spacing w:after="20"/>
+            </w:pPr>
             <w:r>
               <w:rPr>
                 <w:rFonts w:ascii="Calibri" w:hAnsi="Calibri"/>
                 <w:b/>
                 <w:color w:val="FFFFFF"/>
-                <w:sz w:val="19"/>
+                <w:sz w:val="18"/>
               </w:rPr>
               <w:t>Tipo de Modificación</w:t>
             </w:r>
@@ -880,16 +801,19 @@
         </w:tc>
         <w:tc>
           <w:tcPr>
-            <w:tcW w:type="dxa" w:w="2340"/>
+            <w:tcW w:type="dxa" w:w="3456"/>
             <w:shd w:fill="1A365D"/>
           </w:tcPr>
           <w:p>
+            <w:pPr>
+              <w:spacing w:after="20"/>
+            </w:pPr>
             <w:r>
               <w:rPr>
                 <w:rFonts w:ascii="Calibri" w:hAnsi="Calibri"/>
                 <w:b/>
                 <w:color w:val="FFFFFF"/>
-                <w:sz w:val="19"/>
+                <w:sz w:val="18"/>
               </w:rPr>
               <w:t>Justificación / RF Asociado</w:t>
             </w:r>
@@ -897,21 +821,26 @@
         </w:tc>
       </w:tr>
       <w:tr>
+        <w:trPr>
+          <w:cantSplit/>
+          <w:cantSplit/>
+          <w:cantSplit/>
+        </w:trPr>
         <w:tc>
           <w:tcPr>
-            <w:tcW w:type="dxa" w:w="2340"/>
+            <w:tcW w:type="dxa" w:w="1728"/>
             <w:shd w:fill="F7FAFC"/>
           </w:tcPr>
           <w:p>
             <w:pPr>
-              <w:spacing w:before="40" w:after="40"/>
+              <w:spacing w:before="40" w:after="20"/>
             </w:pPr>
             <w:r>
               <w:rPr>
                 <w:rFonts w:ascii="Calibri" w:hAnsi="Calibri"/>
                 <w:b/>
                 <w:color w:val="2D3748"/>
-                <w:sz w:val="17"/>
+                <w:sz w:val="18"/>
               </w:rPr>
               <w:t>DER Conceptual</w:t>
             </w:r>
@@ -919,17 +848,17 @@
         </w:tc>
         <w:tc>
           <w:tcPr>
-            <w:tcW w:type="dxa" w:w="2340"/>
+            <w:tcW w:type="dxa" w:w="2232"/>
           </w:tcPr>
           <w:p>
             <w:pPr>
-              <w:spacing w:before="40" w:after="40"/>
+              <w:spacing w:before="40" w:after="20"/>
             </w:pPr>
             <w:r>
               <w:rPr>
                 <w:rFonts w:ascii="Calibri" w:hAnsi="Calibri"/>
                 <w:color w:val="2D3748"/>
-                <w:sz w:val="17"/>
+                <w:sz w:val="18"/>
               </w:rPr>
               <w:t>Entidad AVISO DE VENCIMIENTO</w:t>
             </w:r>
@@ -937,17 +866,17 @@
         </w:tc>
         <w:tc>
           <w:tcPr>
-            <w:tcW w:type="dxa" w:w="2340"/>
+            <w:tcW w:type="dxa" w:w="1944"/>
           </w:tcPr>
           <w:p>
             <w:pPr>
-              <w:spacing w:before="40" w:after="40"/>
+              <w:spacing w:before="40" w:after="20"/>
             </w:pPr>
             <w:r>
               <w:rPr>
                 <w:rFonts w:ascii="Calibri" w:hAnsi="Calibri"/>
                 <w:color w:val="2D3748"/>
-                <w:sz w:val="17"/>
+                <w:sz w:val="18"/>
               </w:rPr>
               <w:t>Incorporación</w:t>
             </w:r>
@@ -955,39 +884,42 @@
         </w:tc>
         <w:tc>
           <w:tcPr>
-            <w:tcW w:type="dxa" w:w="2340"/>
+            <w:tcW w:type="dxa" w:w="3456"/>
           </w:tcPr>
           <w:p>
             <w:pPr>
-              <w:spacing w:before="40" w:after="40"/>
+              <w:spacing w:before="40" w:after="20"/>
             </w:pPr>
             <w:r>
               <w:rPr>
-                <w:rFonts w:ascii="Calibri" w:hAnsi="Calibri"/>
-                <w:color w:val="2D3748"/>
-                <w:sz w:val="17"/>
+                <w:sz w:val="18"/>
               </w:rPr>
-              <w:t>RF-17 y RF-18: Se modela como entidad de negocio con atributos de estado, tipo y fechas de intento.</w:t>
+              <w:t>RF-18: entidad para auditar el aviso preventivo o por mora y su resultado de envío.</w:t>
             </w:r>
           </w:p>
         </w:tc>
       </w:tr>
       <w:tr>
+        <w:trPr>
+          <w:cantSplit/>
+          <w:cantSplit/>
+          <w:cantSplit/>
+        </w:trPr>
         <w:tc>
           <w:tcPr>
-            <w:tcW w:type="dxa" w:w="2340"/>
+            <w:tcW w:type="dxa" w:w="1728"/>
             <w:shd w:fill="F7FAFC"/>
           </w:tcPr>
           <w:p>
             <w:pPr>
-              <w:spacing w:before="40" w:after="40"/>
+              <w:spacing w:before="40" w:after="20"/>
             </w:pPr>
             <w:r>
               <w:rPr>
                 <w:rFonts w:ascii="Calibri" w:hAnsi="Calibri"/>
                 <w:b/>
                 <w:color w:val="2D3748"/>
-                <w:sz w:val="17"/>
+                <w:sz w:val="18"/>
               </w:rPr>
               <w:t>DER Conceptual</w:t>
             </w:r>
@@ -995,17 +927,17 @@
         </w:tc>
         <w:tc>
           <w:tcPr>
-            <w:tcW w:type="dxa" w:w="2340"/>
+            <w:tcW w:type="dxa" w:w="2232"/>
           </w:tcPr>
           <w:p>
             <w:pPr>
-              <w:spacing w:before="40" w:after="40"/>
+              <w:spacing w:before="40" w:after="20"/>
             </w:pPr>
             <w:r>
               <w:rPr>
                 <w:rFonts w:ascii="Calibri" w:hAnsi="Calibri"/>
                 <w:color w:val="2D3748"/>
-                <w:sz w:val="17"/>
+                <w:sz w:val="18"/>
               </w:rPr>
               <w:t>Relación CUOTA — AVISO</w:t>
             </w:r>
@@ -1013,17 +945,17 @@
         </w:tc>
         <w:tc>
           <w:tcPr>
-            <w:tcW w:type="dxa" w:w="2340"/>
+            <w:tcW w:type="dxa" w:w="1944"/>
           </w:tcPr>
           <w:p>
             <w:pPr>
-              <w:spacing w:before="40" w:after="40"/>
+              <w:spacing w:before="40" w:after="20"/>
             </w:pPr>
             <w:r>
               <w:rPr>
                 <w:rFonts w:ascii="Calibri" w:hAnsi="Calibri"/>
                 <w:color w:val="2D3748"/>
-                <w:sz w:val="17"/>
+                <w:sz w:val="18"/>
               </w:rPr>
               <w:t>Nueva relación 1:N</w:t>
             </w:r>
@@ -1031,17 +963,17 @@
         </w:tc>
         <w:tc>
           <w:tcPr>
-            <w:tcW w:type="dxa" w:w="2340"/>
+            <w:tcW w:type="dxa" w:w="3456"/>
           </w:tcPr>
           <w:p>
             <w:pPr>
-              <w:spacing w:before="40" w:after="40"/>
+              <w:spacing w:before="40" w:after="20"/>
             </w:pPr>
             <w:r>
               <w:rPr>
                 <w:rFonts w:ascii="Calibri" w:hAnsi="Calibri"/>
                 <w:color w:val="2D3748"/>
-                <w:sz w:val="17"/>
+                <w:sz w:val="18"/>
               </w:rPr>
               <w:t>Una cuota genera avisos preventivos y por mora; el aviso audita el estado del recordatorio.</w:t>
             </w:r>
@@ -1049,21 +981,26 @@
         </w:tc>
       </w:tr>
       <w:tr>
+        <w:trPr>
+          <w:cantSplit/>
+          <w:cantSplit/>
+          <w:cantSplit/>
+        </w:trPr>
         <w:tc>
           <w:tcPr>
-            <w:tcW w:type="dxa" w:w="2340"/>
+            <w:tcW w:type="dxa" w:w="1728"/>
             <w:shd w:fill="F7FAFC"/>
           </w:tcPr>
           <w:p>
             <w:pPr>
-              <w:spacing w:before="40" w:after="40"/>
+              <w:spacing w:before="40" w:after="20"/>
             </w:pPr>
             <w:r>
               <w:rPr>
                 <w:rFonts w:ascii="Calibri" w:hAnsi="Calibri"/>
                 <w:b/>
                 <w:color w:val="2D3748"/>
-                <w:sz w:val="17"/>
+                <w:sz w:val="18"/>
               </w:rPr>
               <w:t>DER Conceptual</w:t>
             </w:r>
@@ -1071,17 +1008,17 @@
         </w:tc>
         <w:tc>
           <w:tcPr>
-            <w:tcW w:type="dxa" w:w="2340"/>
+            <w:tcW w:type="dxa" w:w="2232"/>
           </w:tcPr>
           <w:p>
             <w:pPr>
-              <w:spacing w:before="40" w:after="40"/>
+              <w:spacing w:before="40" w:after="20"/>
             </w:pPr>
             <w:r>
               <w:rPr>
                 <w:rFonts w:ascii="Calibri" w:hAnsi="Calibri"/>
                 <w:color w:val="2D3748"/>
-                <w:sz w:val="17"/>
+                <w:sz w:val="18"/>
               </w:rPr>
               <w:t>Relación CONVERSACIÓN — AVISO</w:t>
             </w:r>
@@ -1089,17 +1026,17 @@
         </w:tc>
         <w:tc>
           <w:tcPr>
-            <w:tcW w:type="dxa" w:w="2340"/>
+            <w:tcW w:type="dxa" w:w="1944"/>
           </w:tcPr>
           <w:p>
             <w:pPr>
-              <w:spacing w:before="40" w:after="40"/>
+              <w:spacing w:before="40" w:after="20"/>
             </w:pPr>
             <w:r>
               <w:rPr>
                 <w:rFonts w:ascii="Calibri" w:hAnsi="Calibri"/>
                 <w:color w:val="2D3748"/>
-                <w:sz w:val="17"/>
+                <w:sz w:val="18"/>
               </w:rPr>
               <w:t>Nueva relación 0..1:N</w:t>
             </w:r>
@@ -1107,17 +1044,17 @@
         </w:tc>
         <w:tc>
           <w:tcPr>
-            <w:tcW w:type="dxa" w:w="2340"/>
+            <w:tcW w:type="dxa" w:w="3456"/>
           </w:tcPr>
           <w:p>
             <w:pPr>
-              <w:spacing w:before="40" w:after="40"/>
+              <w:spacing w:before="40" w:after="20"/>
             </w:pPr>
             <w:r>
               <w:rPr>
                 <w:rFonts w:ascii="Calibri" w:hAnsi="Calibri"/>
                 <w:color w:val="2D3748"/>
-                <w:sz w:val="17"/>
+                <w:sz w:val="18"/>
               </w:rPr>
               <w:t>Canalización opcional del aviso mediante el chat de WhatsApp del cliente.</w:t>
             </w:r>
@@ -1125,21 +1062,26 @@
         </w:tc>
       </w:tr>
       <w:tr>
+        <w:trPr>
+          <w:cantSplit/>
+          <w:cantSplit/>
+          <w:cantSplit/>
+        </w:trPr>
         <w:tc>
           <w:tcPr>
-            <w:tcW w:type="dxa" w:w="2340"/>
+            <w:tcW w:type="dxa" w:w="1728"/>
             <w:shd w:fill="F7FAFC"/>
           </w:tcPr>
           <w:p>
             <w:pPr>
-              <w:spacing w:before="40" w:after="40"/>
+              <w:spacing w:before="40" w:after="20"/>
             </w:pPr>
             <w:r>
               <w:rPr>
                 <w:rFonts w:ascii="Calibri" w:hAnsi="Calibri"/>
                 <w:b/>
                 <w:color w:val="2D3748"/>
-                <w:sz w:val="17"/>
+                <w:sz w:val="18"/>
               </w:rPr>
               <w:t>DER Lógico</w:t>
             </w:r>
@@ -1147,17 +1089,17 @@
         </w:tc>
         <w:tc>
           <w:tcPr>
-            <w:tcW w:type="dxa" w:w="2340"/>
+            <w:tcW w:type="dxa" w:w="2232"/>
           </w:tcPr>
           <w:p>
             <w:pPr>
-              <w:spacing w:before="40" w:after="40"/>
+              <w:spacing w:before="40" w:after="20"/>
             </w:pPr>
             <w:r>
               <w:rPr>
                 <w:rFonts w:ascii="Calibri" w:hAnsi="Calibri"/>
                 <w:color w:val="2D3748"/>
-                <w:sz w:val="17"/>
+                <w:sz w:val="18"/>
               </w:rPr>
               <w:t>Tabla aviso_vencimiento</w:t>
             </w:r>
@@ -1165,17 +1107,17 @@
         </w:tc>
         <w:tc>
           <w:tcPr>
-            <w:tcW w:type="dxa" w:w="2340"/>
+            <w:tcW w:type="dxa" w:w="1944"/>
           </w:tcPr>
           <w:p>
             <w:pPr>
-              <w:spacing w:before="40" w:after="40"/>
+              <w:spacing w:before="40" w:after="20"/>
             </w:pPr>
             <w:r>
               <w:rPr>
                 <w:rFonts w:ascii="Calibri" w:hAnsi="Calibri"/>
                 <w:color w:val="2D3748"/>
-                <w:sz w:val="17"/>
+                <w:sz w:val="18"/>
               </w:rPr>
               <w:t>Nueva tabla en 3FN</w:t>
             </w:r>
@@ -1183,17 +1125,17 @@
         </w:tc>
         <w:tc>
           <w:tcPr>
-            <w:tcW w:type="dxa" w:w="2340"/>
+            <w:tcW w:type="dxa" w:w="3456"/>
           </w:tcPr>
           <w:p>
             <w:pPr>
-              <w:spacing w:before="40" w:after="40"/>
+              <w:spacing w:before="40" w:after="20"/>
             </w:pPr>
             <w:r>
               <w:rPr>
                 <w:rFonts w:ascii="Calibri" w:hAnsi="Calibri"/>
                 <w:color w:val="2D3748"/>
-                <w:sz w:val="17"/>
+                <w:sz w:val="18"/>
               </w:rPr>
               <w:t>Estructura completa con PK, FK a cuota, FKs opcionales a conversación/mensaje y UNIQUE compuesto.</w:t>
             </w:r>
@@ -1201,21 +1143,26 @@
         </w:tc>
       </w:tr>
       <w:tr>
+        <w:trPr>
+          <w:cantSplit/>
+          <w:cantSplit/>
+          <w:cantSplit/>
+        </w:trPr>
         <w:tc>
           <w:tcPr>
-            <w:tcW w:type="dxa" w:w="2340"/>
+            <w:tcW w:type="dxa" w:w="1728"/>
             <w:shd w:fill="F7FAFC"/>
           </w:tcPr>
           <w:p>
             <w:pPr>
-              <w:spacing w:before="40" w:after="40"/>
+              <w:spacing w:before="40" w:after="20"/>
             </w:pPr>
             <w:r>
               <w:rPr>
                 <w:rFonts w:ascii="Calibri" w:hAnsi="Calibri"/>
                 <w:b/>
                 <w:color w:val="2D3748"/>
-                <w:sz w:val="17"/>
+                <w:sz w:val="18"/>
               </w:rPr>
               <w:t>DER Lógico</w:t>
             </w:r>
@@ -1223,17 +1170,17 @@
         </w:tc>
         <w:tc>
           <w:tcPr>
-            <w:tcW w:type="dxa" w:w="2340"/>
+            <w:tcW w:type="dxa" w:w="2232"/>
           </w:tcPr>
           <w:p>
             <w:pPr>
-              <w:spacing w:before="40" w:after="40"/>
+              <w:spacing w:before="40" w:after="20"/>
             </w:pPr>
             <w:r>
               <w:rPr>
                 <w:rFonts w:ascii="Calibri" w:hAnsi="Calibri"/>
                 <w:color w:val="2D3748"/>
-                <w:sz w:val="17"/>
+                <w:sz w:val="18"/>
               </w:rPr>
               <w:t>Tabla conversacion</w:t>
             </w:r>
@@ -1241,17 +1188,17 @@
         </w:tc>
         <w:tc>
           <w:tcPr>
-            <w:tcW w:type="dxa" w:w="2340"/>
+            <w:tcW w:type="dxa" w:w="1944"/>
           </w:tcPr>
           <w:p>
             <w:pPr>
-              <w:spacing w:before="40" w:after="40"/>
+              <w:spacing w:before="40" w:after="20"/>
             </w:pPr>
             <w:r>
               <w:rPr>
                 <w:rFonts w:ascii="Calibri" w:hAnsi="Calibri"/>
                 <w:color w:val="2D3748"/>
-                <w:sz w:val="17"/>
+                <w:sz w:val="18"/>
               </w:rPr>
               <w:t>Modificación de columnas</w:t>
             </w:r>
@@ -1259,17 +1206,17 @@
         </w:tc>
         <w:tc>
           <w:tcPr>
-            <w:tcW w:type="dxa" w:w="2340"/>
+            <w:tcW w:type="dxa" w:w="3456"/>
           </w:tcPr>
           <w:p>
             <w:pPr>
-              <w:spacing w:before="40" w:after="40"/>
+              <w:spacing w:before="40" w:after="20"/>
             </w:pPr>
             <w:r>
               <w:rPr>
                 <w:rFonts w:ascii="Calibri" w:hAnsi="Calibri"/>
                 <w:color w:val="2D3748"/>
-                <w:sz w:val="17"/>
+                <w:sz w:val="18"/>
               </w:rPr>
               <w:t>id_cliente como nullable; incorporación de estado_flujo, intentos_intencion y datos_registro (JSON).</w:t>
             </w:r>
@@ -1277,21 +1224,26 @@
         </w:tc>
       </w:tr>
       <w:tr>
+        <w:trPr>
+          <w:cantSplit/>
+          <w:cantSplit/>
+          <w:cantSplit/>
+        </w:trPr>
         <w:tc>
           <w:tcPr>
-            <w:tcW w:type="dxa" w:w="2340"/>
+            <w:tcW w:type="dxa" w:w="1728"/>
             <w:shd w:fill="F7FAFC"/>
           </w:tcPr>
           <w:p>
             <w:pPr>
-              <w:spacing w:before="40" w:after="40"/>
+              <w:spacing w:before="40" w:after="20"/>
             </w:pPr>
             <w:r>
               <w:rPr>
                 <w:rFonts w:ascii="Calibri" w:hAnsi="Calibri"/>
                 <w:b/>
                 <w:color w:val="2D3748"/>
-                <w:sz w:val="17"/>
+                <w:sz w:val="18"/>
               </w:rPr>
               <w:t>DER Lógico</w:t>
             </w:r>
@@ -1299,17 +1251,17 @@
         </w:tc>
         <w:tc>
           <w:tcPr>
-            <w:tcW w:type="dxa" w:w="2340"/>
+            <w:tcW w:type="dxa" w:w="2232"/>
           </w:tcPr>
           <w:p>
             <w:pPr>
-              <w:spacing w:before="40" w:after="40"/>
+              <w:spacing w:before="40" w:after="20"/>
             </w:pPr>
             <w:r>
               <w:rPr>
                 <w:rFonts w:ascii="Calibri" w:hAnsi="Calibri"/>
                 <w:color w:val="2D3748"/>
-                <w:sz w:val="17"/>
+                <w:sz w:val="18"/>
               </w:rPr>
               <w:t>Tabla comprobante</w:t>
             </w:r>
@@ -1317,17 +1269,17 @@
         </w:tc>
         <w:tc>
           <w:tcPr>
-            <w:tcW w:type="dxa" w:w="2340"/>
+            <w:tcW w:type="dxa" w:w="1944"/>
           </w:tcPr>
           <w:p>
             <w:pPr>
-              <w:spacing w:before="40" w:after="40"/>
+              <w:spacing w:before="40" w:after="20"/>
             </w:pPr>
             <w:r>
               <w:rPr>
                 <w:rFonts w:ascii="Calibri" w:hAnsi="Calibri"/>
                 <w:color w:val="2D3748"/>
-                <w:sz w:val="17"/>
+                <w:sz w:val="18"/>
               </w:rPr>
               <w:t>Atributos de auditoría</w:t>
             </w:r>
@@ -1335,39 +1287,42 @@
         </w:tc>
         <w:tc>
           <w:tcPr>
-            <w:tcW w:type="dxa" w:w="2340"/>
+            <w:tcW w:type="dxa" w:w="3456"/>
           </w:tcPr>
           <w:p>
             <w:pPr>
-              <w:spacing w:before="40" w:after="40"/>
+              <w:spacing w:before="40" w:after="20"/>
             </w:pPr>
             <w:r>
               <w:rPr>
-                <w:rFonts w:ascii="Calibri" w:hAnsi="Calibri"/>
-                <w:color w:val="2D3748"/>
-                <w:sz w:val="17"/>
+                <w:sz w:val="18"/>
               </w:rPr>
-              <w:t>Incorporación de hash_archivo (UNIQUE), confianza_ocr, numero_operacion y estado_validacion.</w:t>
+              <w:t>RF-19 a RF-26: esquema con campos previstos para OCR, operación y hash; el código aún no calcula el hash ni ejecuta OCR o conciliación.</w:t>
             </w:r>
           </w:p>
         </w:tc>
       </w:tr>
       <w:tr>
+        <w:trPr>
+          <w:cantSplit/>
+          <w:cantSplit/>
+          <w:cantSplit/>
+        </w:trPr>
         <w:tc>
           <w:tcPr>
-            <w:tcW w:type="dxa" w:w="2340"/>
+            <w:tcW w:type="dxa" w:w="1728"/>
             <w:shd w:fill="F7FAFC"/>
           </w:tcPr>
           <w:p>
             <w:pPr>
-              <w:spacing w:before="40" w:after="40"/>
+              <w:spacing w:before="40" w:after="20"/>
             </w:pPr>
             <w:r>
               <w:rPr>
                 <w:rFonts w:ascii="Calibri" w:hAnsi="Calibri"/>
                 <w:b/>
                 <w:color w:val="2D3748"/>
-                <w:sz w:val="17"/>
+                <w:sz w:val="18"/>
               </w:rPr>
               <w:t>DER Lógico</w:t>
             </w:r>
@@ -1375,17 +1330,17 @@
         </w:tc>
         <w:tc>
           <w:tcPr>
-            <w:tcW w:type="dxa" w:w="2340"/>
+            <w:tcW w:type="dxa" w:w="2232"/>
           </w:tcPr>
           <w:p>
             <w:pPr>
-              <w:spacing w:before="40" w:after="40"/>
+              <w:spacing w:before="40" w:after="20"/>
             </w:pPr>
             <w:r>
               <w:rPr>
                 <w:rFonts w:ascii="Calibri" w:hAnsi="Calibri"/>
                 <w:color w:val="2D3748"/>
-                <w:sz w:val="17"/>
+                <w:sz w:val="18"/>
               </w:rPr>
               <w:t>Tabla pago</w:t>
             </w:r>
@@ -1393,17 +1348,17 @@
         </w:tc>
         <w:tc>
           <w:tcPr>
-            <w:tcW w:type="dxa" w:w="2340"/>
+            <w:tcW w:type="dxa" w:w="1944"/>
           </w:tcPr>
           <w:p>
             <w:pPr>
-              <w:spacing w:before="40" w:after="40"/>
+              <w:spacing w:before="40" w:after="20"/>
             </w:pPr>
             <w:r>
               <w:rPr>
                 <w:rFonts w:ascii="Calibri" w:hAnsi="Calibri"/>
                 <w:color w:val="2D3748"/>
-                <w:sz w:val="17"/>
+                <w:sz w:val="18"/>
               </w:rPr>
               <w:t>Integridad referencial</w:t>
             </w:r>
@@ -1411,17 +1366,17 @@
         </w:tc>
         <w:tc>
           <w:tcPr>
-            <w:tcW w:type="dxa" w:w="2340"/>
+            <w:tcW w:type="dxa" w:w="3456"/>
           </w:tcPr>
           <w:p>
             <w:pPr>
-              <w:spacing w:before="40" w:after="40"/>
+              <w:spacing w:before="40" w:after="20"/>
             </w:pPr>
             <w:r>
               <w:rPr>
                 <w:rFonts w:ascii="Calibri" w:hAnsi="Calibri"/>
                 <w:color w:val="2D3748"/>
-                <w:sz w:val="17"/>
+                <w:sz w:val="18"/>
               </w:rPr>
               <w:t>id_comprobante nullable con constraint UNIQUE (asociación 0..1 a 1 comprobante-pago).</w:t>
             </w:r>
@@ -1429,21 +1384,26 @@
         </w:tc>
       </w:tr>
       <w:tr>
+        <w:trPr>
+          <w:cantSplit/>
+          <w:cantSplit/>
+          <w:cantSplit/>
+        </w:trPr>
         <w:tc>
           <w:tcPr>
-            <w:tcW w:type="dxa" w:w="2340"/>
+            <w:tcW w:type="dxa" w:w="1728"/>
             <w:shd w:fill="F7FAFC"/>
           </w:tcPr>
           <w:p>
             <w:pPr>
-              <w:spacing w:before="40" w:after="40"/>
+              <w:spacing w:before="40" w:after="20"/>
             </w:pPr>
             <w:r>
               <w:rPr>
                 <w:rFonts w:ascii="Calibri" w:hAnsi="Calibri"/>
                 <w:b/>
                 <w:color w:val="2D3748"/>
-                <w:sz w:val="17"/>
+                <w:sz w:val="18"/>
               </w:rPr>
               <w:t>Diagrama de Clases</w:t>
             </w:r>
@@ -1451,17 +1411,17 @@
         </w:tc>
         <w:tc>
           <w:tcPr>
-            <w:tcW w:type="dxa" w:w="2340"/>
+            <w:tcW w:type="dxa" w:w="2232"/>
           </w:tcPr>
           <w:p>
             <w:pPr>
-              <w:spacing w:before="40" w:after="40"/>
+              <w:spacing w:before="40" w:after="20"/>
             </w:pPr>
             <w:r>
               <w:rPr>
                 <w:rFonts w:ascii="Calibri" w:hAnsi="Calibri"/>
                 <w:color w:val="2D3748"/>
-                <w:sz w:val="17"/>
+                <w:sz w:val="18"/>
               </w:rPr>
               <w:t>Clase AvisoVencimiento</w:t>
             </w:r>
@@ -1469,17 +1429,17 @@
         </w:tc>
         <w:tc>
           <w:tcPr>
-            <w:tcW w:type="dxa" w:w="2340"/>
+            <w:tcW w:type="dxa" w:w="1944"/>
           </w:tcPr>
           <w:p>
             <w:pPr>
-              <w:spacing w:before="40" w:after="40"/>
+              <w:spacing w:before="40" w:after="20"/>
             </w:pPr>
             <w:r>
               <w:rPr>
                 <w:rFonts w:ascii="Calibri" w:hAnsi="Calibri"/>
                 <w:color w:val="2D3748"/>
-                <w:sz w:val="17"/>
+                <w:sz w:val="18"/>
               </w:rPr>
               <w:t>Nueva clase de entidad</w:t>
             </w:r>
@@ -1487,39 +1447,42 @@
         </w:tc>
         <w:tc>
           <w:tcPr>
-            <w:tcW w:type="dxa" w:w="2340"/>
+            <w:tcW w:type="dxa" w:w="3456"/>
           </w:tcPr>
           <w:p>
             <w:pPr>
-              <w:spacing w:before="40" w:after="40"/>
+              <w:spacing w:before="40" w:after="20"/>
             </w:pPr>
             <w:r>
               <w:rPr>
-                <w:rFonts w:ascii="Calibri" w:hAnsi="Calibri"/>
-                <w:color w:val="2D3748"/>
-                <w:sz w:val="17"/>
+                <w:sz w:val="18"/>
               </w:rPr>
-              <w:t>Atributos completos y métodos de negocio: cuota(), conversacion(), mensaje(), marcarEnviado().</w:t>
+              <w:t>Atributos y relaciones cotejados con el modelo Eloquent y la migración vigente.</w:t>
             </w:r>
           </w:p>
         </w:tc>
       </w:tr>
       <w:tr>
+        <w:trPr>
+          <w:cantSplit/>
+          <w:cantSplit/>
+          <w:cantSplit/>
+        </w:trPr>
         <w:tc>
           <w:tcPr>
-            <w:tcW w:type="dxa" w:w="2340"/>
+            <w:tcW w:type="dxa" w:w="1728"/>
             <w:shd w:fill="F7FAFC"/>
           </w:tcPr>
           <w:p>
             <w:pPr>
-              <w:spacing w:before="40" w:after="40"/>
+              <w:spacing w:before="40" w:after="20"/>
             </w:pPr>
             <w:r>
               <w:rPr>
                 <w:rFonts w:ascii="Calibri" w:hAnsi="Calibri"/>
                 <w:b/>
                 <w:color w:val="2D3748"/>
-                <w:sz w:val="17"/>
+                <w:sz w:val="18"/>
               </w:rPr>
               <w:t>Diagrama de Clases</w:t>
             </w:r>
@@ -1527,17 +1490,17 @@
         </w:tc>
         <w:tc>
           <w:tcPr>
-            <w:tcW w:type="dxa" w:w="2340"/>
+            <w:tcW w:type="dxa" w:w="2232"/>
           </w:tcPr>
           <w:p>
             <w:pPr>
-              <w:spacing w:before="40" w:after="40"/>
+              <w:spacing w:before="40" w:after="20"/>
             </w:pPr>
             <w:r>
               <w:rPr>
                 <w:rFonts w:ascii="Calibri" w:hAnsi="Calibri"/>
                 <w:color w:val="2D3748"/>
-                <w:sz w:val="17"/>
+                <w:sz w:val="18"/>
               </w:rPr>
               <w:t>Clase Conversacion</w:t>
             </w:r>
@@ -1545,17 +1508,17 @@
         </w:tc>
         <w:tc>
           <w:tcPr>
-            <w:tcW w:type="dxa" w:w="2340"/>
+            <w:tcW w:type="dxa" w:w="1944"/>
           </w:tcPr>
           <w:p>
             <w:pPr>
-              <w:spacing w:before="40" w:after="40"/>
+              <w:spacing w:before="40" w:after="20"/>
             </w:pPr>
             <w:r>
               <w:rPr>
                 <w:rFonts w:ascii="Calibri" w:hAnsi="Calibri"/>
                 <w:color w:val="2D3748"/>
-                <w:sz w:val="17"/>
+                <w:sz w:val="18"/>
               </w:rPr>
               <w:t>Actualización de miembros</w:t>
             </w:r>
@@ -1563,17 +1526,17 @@
         </w:tc>
         <w:tc>
           <w:tcPr>
-            <w:tcW w:type="dxa" w:w="2340"/>
+            <w:tcW w:type="dxa" w:w="3456"/>
           </w:tcPr>
           <w:p>
             <w:pPr>
-              <w:spacing w:before="40" w:after="40"/>
+              <w:spacing w:before="40" w:after="20"/>
             </w:pPr>
             <w:r>
               <w:rPr>
                 <w:rFonts w:ascii="Calibri" w:hAnsi="Calibri"/>
                 <w:color w:val="2D3748"/>
-                <w:sz w:val="17"/>
+                <w:sz w:val="18"/>
               </w:rPr>
               <w:t>Atributos de flujo y métodos de escalado: usuarioAtencion(), avisosVencimiento(), tickets().</w:t>
             </w:r>
@@ -1581,21 +1544,26 @@
         </w:tc>
       </w:tr>
       <w:tr>
+        <w:trPr>
+          <w:cantSplit/>
+          <w:cantSplit/>
+          <w:cantSplit/>
+        </w:trPr>
         <w:tc>
           <w:tcPr>
-            <w:tcW w:type="dxa" w:w="2340"/>
+            <w:tcW w:type="dxa" w:w="1728"/>
             <w:shd w:fill="F7FAFC"/>
           </w:tcPr>
           <w:p>
             <w:pPr>
-              <w:spacing w:before="40" w:after="40"/>
+              <w:spacing w:before="40" w:after="20"/>
             </w:pPr>
             <w:r>
               <w:rPr>
                 <w:rFonts w:ascii="Calibri" w:hAnsi="Calibri"/>
                 <w:b/>
                 <w:color w:val="2D3748"/>
-                <w:sz w:val="17"/>
+                <w:sz w:val="18"/>
               </w:rPr>
               <w:t>Diagrama de Clases</w:t>
             </w:r>
@@ -1603,17 +1571,17 @@
         </w:tc>
         <w:tc>
           <w:tcPr>
-            <w:tcW w:type="dxa" w:w="2340"/>
+            <w:tcW w:type="dxa" w:w="2232"/>
           </w:tcPr>
           <w:p>
             <w:pPr>
-              <w:spacing w:before="40" w:after="40"/>
+              <w:spacing w:before="40" w:after="20"/>
             </w:pPr>
             <w:r>
               <w:rPr>
                 <w:rFonts w:ascii="Calibri" w:hAnsi="Calibri"/>
                 <w:color w:val="2D3748"/>
-                <w:sz w:val="17"/>
+                <w:sz w:val="18"/>
               </w:rPr>
               <w:t>Clases Cuota, Mensaje, Usuario</w:t>
             </w:r>
@@ -1621,17 +1589,17 @@
         </w:tc>
         <w:tc>
           <w:tcPr>
-            <w:tcW w:type="dxa" w:w="2340"/>
+            <w:tcW w:type="dxa" w:w="1944"/>
           </w:tcPr>
           <w:p>
             <w:pPr>
-              <w:spacing w:before="40" w:after="40"/>
+              <w:spacing w:before="40" w:after="20"/>
             </w:pPr>
             <w:r>
               <w:rPr>
                 <w:rFonts w:ascii="Calibri" w:hAnsi="Calibri"/>
                 <w:color w:val="2D3748"/>
-                <w:sz w:val="17"/>
+                <w:sz w:val="18"/>
               </w:rPr>
               <w:t>Relaciones Eloquent</w:t>
             </w:r>
@@ -1639,17 +1607,17 @@
         </w:tc>
         <w:tc>
           <w:tcPr>
-            <w:tcW w:type="dxa" w:w="2340"/>
+            <w:tcW w:type="dxa" w:w="3456"/>
           </w:tcPr>
           <w:p>
             <w:pPr>
-              <w:spacing w:before="40" w:after="40"/>
+              <w:spacing w:before="40" w:after="20"/>
             </w:pPr>
             <w:r>
               <w:rPr>
                 <w:rFonts w:ascii="Calibri" w:hAnsi="Calibri"/>
                 <w:color w:val="2D3748"/>
-                <w:sz w:val="17"/>
+                <w:sz w:val="18"/>
               </w:rPr>
               <w:t>Sincronización de métodos hasMany y belongsTo para reflejar el modelo de dominio activo.</w:t>
             </w:r>
@@ -1665,6 +1633,7 @@
     <w:p>
       <w:pPr>
         <w:keepNext/>
+        <w:pageBreakBefore/>
         <w:spacing w:before="320" w:after="120"/>
       </w:pPr>
       <w:r>
@@ -1695,6 +1664,7 @@
       <w:tblPr>
         <w:tblW w:type="auto" w:w="0"/>
         <w:jc w:val="center"/>
+        <w:tblLayout w:type="fixed"/>
         <w:tblLook w:firstColumn="1" w:firstRow="1" w:lastColumn="0" w:lastRow="0" w:noHBand="0" w:noVBand="1" w:val="04A0"/>
       </w:tblPr>
       <w:tblGrid>
@@ -1704,18 +1674,26 @@
         <w:gridCol w:w="2340"/>
       </w:tblGrid>
       <w:tr>
+        <w:trPr>
+          <w:tblHeader w:val="true"/>
+          <w:cantSplit/>
+          <w:tblHeader w:val="true"/>
+          <w:cantSplit/>
+          <w:tblHeader w:val="true"/>
+          <w:cantSplit/>
+        </w:trPr>
         <w:tc>
           <w:tcPr>
             <w:tcW w:type="dxa" w:w="2340"/>
             <w:shd w:fill="2B6CB0"/>
           </w:tcPr>
           <w:p>
+            <w:pPr>
+              <w:spacing w:after="40"/>
+            </w:pPr>
             <w:r>
               <w:rPr>
-                <w:rFonts w:ascii="Calibri" w:hAnsi="Calibri"/>
-                <w:b/>
-                <w:color w:val="FFFFFF"/>
-                <w:sz w:val="19"/>
+                <w:sz w:val="18"/>
               </w:rPr>
               <w:t>Requerimiento Funcional</w:t>
             </w:r>
@@ -1727,14 +1705,14 @@
             <w:shd w:fill="2B6CB0"/>
           </w:tcPr>
           <w:p>
+            <w:pPr>
+              <w:spacing w:after="40"/>
+            </w:pPr>
             <w:r>
               <w:rPr>
-                <w:rFonts w:ascii="Calibri" w:hAnsi="Calibri"/>
-                <w:b/>
-                <w:color w:val="FFFFFF"/>
-                <w:sz w:val="19"/>
+                <w:sz w:val="18"/>
               </w:rPr>
-              <w:t>Necesidad Detectada</w:t>
+              <w:t>Necesidad / Alcance</w:t>
             </w:r>
           </w:p>
         </w:tc>
@@ -1744,12 +1722,12 @@
             <w:shd w:fill="2B6CB0"/>
           </w:tcPr>
           <w:p>
+            <w:pPr>
+              <w:spacing w:after="40"/>
+            </w:pPr>
             <w:r>
               <w:rPr>
-                <w:rFonts w:ascii="Calibri" w:hAnsi="Calibri"/>
-                <w:b/>
-                <w:color w:val="FFFFFF"/>
-                <w:sz w:val="19"/>
+                <w:sz w:val="18"/>
               </w:rPr>
               <w:t>Reflejo en Diagramas</w:t>
             </w:r>
@@ -1761,19 +1739,24 @@
             <w:shd w:fill="2B6CB0"/>
           </w:tcPr>
           <w:p>
+            <w:pPr>
+              <w:spacing w:after="40"/>
+            </w:pPr>
             <w:r>
               <w:rPr>
-                <w:rFonts w:ascii="Calibri" w:hAnsi="Calibri"/>
-                <w:b/>
-                <w:color w:val="FFFFFF"/>
-                <w:sz w:val="19"/>
+                <w:sz w:val="18"/>
               </w:rPr>
-              <w:t>Componente de Software</w:t>
+              <w:t>Componente / Estado</w:t>
             </w:r>
           </w:p>
         </w:tc>
       </w:tr>
       <w:tr>
+        <w:trPr>
+          <w:cantSplit/>
+          <w:cantSplit/>
+          <w:cantSplit/>
+        </w:trPr>
         <w:tc>
           <w:tcPr>
             <w:tcW w:type="dxa" w:w="2340"/>
@@ -1785,12 +1768,9 @@
             </w:pPr>
             <w:r>
               <w:rPr>
-                <w:rFonts w:ascii="Calibri" w:hAnsi="Calibri"/>
-                <w:b/>
-                <w:color w:val="2D3748"/>
-                <w:sz w:val="17"/>
+                <w:sz w:val="18"/>
               </w:rPr>
-              <w:t>RF-10: Iniciar conversación WhatsApp</w:t>
+              <w:t>RF-10: Recepción y respuesta automática</w:t>
             </w:r>
           </w:p>
         </w:tc>
@@ -1804,11 +1784,9 @@
             </w:pPr>
             <w:r>
               <w:rPr>
-                <w:rFonts w:ascii="Calibri" w:hAnsi="Calibri"/>
-                <w:color w:val="2D3748"/>
-                <w:sz w:val="17"/>
+                <w:sz w:val="18"/>
               </w:rPr>
-              <w:t>Recibir mensajes de números no registrados previamente.</w:t>
+              <w:t>Recibir mensajes de WhatsApp y responder mediante el bot.</w:t>
             </w:r>
           </w:p>
         </w:tc>
@@ -1822,11 +1800,9 @@
             </w:pPr>
             <w:r>
               <w:rPr>
-                <w:rFonts w:ascii="Calibri" w:hAnsi="Calibri"/>
-                <w:color w:val="2D3748"/>
-                <w:sz w:val="17"/>
+                <w:sz w:val="18"/>
               </w:rPr>
-              <w:t>conversacion: id_cliente nullable, numero_whatsapp obligatorio.</w:t>
+              <w:t>Caso de Uso M2; Secuencia Recepción y Bot.</w:t>
             </w:r>
           </w:p>
         </w:tc>
@@ -1840,16 +1816,19 @@
             </w:pPr>
             <w:r>
               <w:rPr>
-                <w:rFonts w:ascii="Calibri" w:hAnsi="Calibri"/>
-                <w:color w:val="2D3748"/>
-                <w:sz w:val="17"/>
+                <w:sz w:val="18"/>
               </w:rPr>
-              <w:t>ServicioRecepcionWhatsapp / Modelo Conversacion</w:t>
+              <w:t>ServicioRecepcionWhatsapp y ServicioEnvioWhatsapp; cubierto para los tipos admitidos.</w:t>
             </w:r>
           </w:p>
         </w:tc>
       </w:tr>
       <w:tr>
+        <w:trPr>
+          <w:cantSplit/>
+          <w:cantSplit/>
+          <w:cantSplit/>
+        </w:trPr>
         <w:tc>
           <w:tcPr>
             <w:tcW w:type="dxa" w:w="2340"/>
@@ -1861,12 +1840,9 @@
             </w:pPr>
             <w:r>
               <w:rPr>
-                <w:rFonts w:ascii="Calibri" w:hAnsi="Calibri"/>
-                <w:b/>
-                <w:color w:val="2D3748"/>
-                <w:sz w:val="17"/>
+                <w:sz w:val="18"/>
               </w:rPr>
-              <w:t>RF-11: Identificación y menú interactivo</w:t>
+              <w:t>RF-11: Reconocimiento de intención por IA</w:t>
             </w:r>
           </w:p>
         </w:tc>
@@ -1880,11 +1856,9 @@
             </w:pPr>
             <w:r>
               <w:rPr>
-                <w:rFonts w:ascii="Calibri" w:hAnsi="Calibri"/>
-                <w:color w:val="2D3748"/>
-                <w:sz w:val="17"/>
+                <w:sz w:val="18"/>
               </w:rPr>
-              <w:t>Guiar al cliente según su DNI o registrar datos parciales.</w:t>
+              <w:t>Reconocer intención, pedir reformulación y derivar tras dos fallos.</w:t>
             </w:r>
           </w:p>
         </w:tc>
@@ -1898,11 +1872,9 @@
             </w:pPr>
             <w:r>
               <w:rPr>
-                <w:rFonts w:ascii="Calibri" w:hAnsi="Calibri"/>
-                <w:color w:val="2D3748"/>
-                <w:sz w:val="17"/>
+                <w:sz w:val="18"/>
               </w:rPr>
-              <w:t>conversacion: estado_flujo, datos_registro (JSON).</w:t>
+              <w:t>Caso de Uso M2; Recepción y Bot; Atención Humana.</w:t>
             </w:r>
           </w:p>
         </w:tc>
@@ -1916,16 +1888,19 @@
             </w:pPr>
             <w:r>
               <w:rPr>
-                <w:rFonts w:ascii="Calibri" w:hAnsi="Calibri"/>
-                <w:color w:val="2D3748"/>
-                <w:sz w:val="17"/>
+                <w:sz w:val="18"/>
               </w:rPr>
-              <w:t>ServicioMenuWhatsapp / ServicioRegistroClienteWhatsapp</w:t>
+              <w:t>ServicioReconocimientoIntencionWhatsapp; Gemini requiere clave y tiene respaldo local.</w:t>
             </w:r>
           </w:p>
         </w:tc>
       </w:tr>
       <w:tr>
+        <w:trPr>
+          <w:cantSplit/>
+          <w:cantSplit/>
+          <w:cantSplit/>
+        </w:trPr>
         <w:tc>
           <w:tcPr>
             <w:tcW w:type="dxa" w:w="2340"/>
@@ -1937,12 +1912,9 @@
             </w:pPr>
             <w:r>
               <w:rPr>
-                <w:rFonts w:ascii="Calibri" w:hAnsi="Calibri"/>
-                <w:b/>
-                <w:color w:val="2D3748"/>
-                <w:sz w:val="17"/>
+                <w:sz w:val="18"/>
               </w:rPr>
-              <w:t>RF-12: Consulta de estado de cuenta</w:t>
+              <w:t>RF-12: Identificación y alta desde el chat</w:t>
             </w:r>
           </w:p>
         </w:tc>
@@ -1956,11 +1928,9 @@
             </w:pPr>
             <w:r>
               <w:rPr>
-                <w:rFonts w:ascii="Calibri" w:hAnsi="Calibri"/>
-                <w:color w:val="2D3748"/>
-                <w:sz w:val="17"/>
+                <w:sz w:val="18"/>
               </w:rPr>
-              <w:t>Recuperar deudas vencidas y datos bancarios desde WhatsApp.</w:t>
+              <w:t>Asociar por teléfono o DNI; permitir alta y contratación a prospectos.</w:t>
             </w:r>
           </w:p>
         </w:tc>
@@ -1974,11 +1944,9 @@
             </w:pPr>
             <w:r>
               <w:rPr>
-                <w:rFonts w:ascii="Calibri" w:hAnsi="Calibri"/>
-                <w:color w:val="2D3748"/>
-                <w:sz w:val="17"/>
+                <w:sz w:val="18"/>
               </w:rPr>
-              <w:t>Relaciones Cuota-Servicio-Cliente vinculadas al chat.</w:t>
+              <w:t>Caso de Uso M2; nueva Secuencia Identificación y Alta.</w:t>
             </w:r>
           </w:p>
         </w:tc>
@@ -1992,16 +1960,19 @@
             </w:pPr>
             <w:r>
               <w:rPr>
-                <w:rFonts w:ascii="Calibri" w:hAnsi="Calibri"/>
-                <w:color w:val="2D3748"/>
-                <w:sz w:val="17"/>
+                <w:sz w:val="18"/>
               </w:rPr>
-              <w:t>ServicioConsultaCuentaWhatsapp / Modelo Cuota</w:t>
+              <w:t>ServicioRegistroClienteWhatsapp; cliente/servicio se crean al completar el flujo.</w:t>
             </w:r>
           </w:p>
         </w:tc>
       </w:tr>
       <w:tr>
+        <w:trPr>
+          <w:cantSplit/>
+          <w:cantSplit/>
+          <w:cantSplit/>
+        </w:trPr>
         <w:tc>
           <w:tcPr>
             <w:tcW w:type="dxa" w:w="2340"/>
@@ -2013,12 +1984,9 @@
             </w:pPr>
             <w:r>
               <w:rPr>
-                <w:rFonts w:ascii="Calibri" w:hAnsi="Calibri"/>
-                <w:b/>
-                <w:color w:val="2D3748"/>
-                <w:sz w:val="17"/>
+                <w:sz w:val="18"/>
               </w:rPr>
-              <w:t>RF-13: Reconocimiento de intenciones IA</w:t>
+              <w:t>RF-13: Consulta de estado de cuenta</w:t>
             </w:r>
           </w:p>
         </w:tc>
@@ -2032,11 +2000,9 @@
             </w:pPr>
             <w:r>
               <w:rPr>
-                <w:rFonts w:ascii="Calibri" w:hAnsi="Calibri"/>
-                <w:color w:val="2D3748"/>
-                <w:sz w:val="17"/>
+                <w:sz w:val="18"/>
               </w:rPr>
-              <w:t>Detectar motivo del mensaje y tolerar fallas de NLP.</w:t>
+              <w:t>Informar estado al día o en mora y próximo vencimiento.</w:t>
             </w:r>
           </w:p>
         </w:tc>
@@ -2050,11 +2016,9 @@
             </w:pPr>
             <w:r>
               <w:rPr>
-                <w:rFonts w:ascii="Calibri" w:hAnsi="Calibri"/>
-                <w:color w:val="2D3748"/>
-                <w:sz w:val="17"/>
+                <w:sz w:val="18"/>
               </w:rPr>
-              <w:t>conversacion.intentos_intencion, clase IAService.</w:t>
+              <w:t>Caso de Uso M2; nueva Secuencia Consulta Estado de Cuenta.</w:t>
             </w:r>
           </w:p>
         </w:tc>
@@ -2068,16 +2032,19 @@
             </w:pPr>
             <w:r>
               <w:rPr>
-                <w:rFonts w:ascii="Calibri" w:hAnsi="Calibri"/>
-                <w:color w:val="2D3748"/>
-                <w:sz w:val="17"/>
+                <w:sz w:val="18"/>
               </w:rPr>
-              <w:t>ServicioReconocimientoIntencionWhatsapp</w:t>
+              <w:t>ServicioConsultaCuentaWhatsapp; incluye cuotas, totales y fecha de vencimiento.</w:t>
             </w:r>
           </w:p>
         </w:tc>
       </w:tr>
       <w:tr>
+        <w:trPr>
+          <w:cantSplit/>
+          <w:cantSplit/>
+          <w:cantSplit/>
+        </w:trPr>
         <w:tc>
           <w:tcPr>
             <w:tcW w:type="dxa" w:w="2340"/>
@@ -2089,12 +2056,9 @@
             </w:pPr>
             <w:r>
               <w:rPr>
-                <w:rFonts w:ascii="Calibri" w:hAnsi="Calibri"/>
-                <w:b/>
-                <w:color w:val="2D3748"/>
-                <w:sz w:val="17"/>
+                <w:sz w:val="18"/>
               </w:rPr>
-              <w:t>RF-14: Recepción de comprobantes OCR</w:t>
+              <w:t>RF-14: Registro de reclamo vía bot</w:t>
             </w:r>
           </w:p>
         </w:tc>
@@ -2108,11 +2072,9 @@
             </w:pPr>
             <w:r>
               <w:rPr>
-                <w:rFonts w:ascii="Calibri" w:hAnsi="Calibri"/>
-                <w:color w:val="2D3748"/>
-                <w:sz w:val="17"/>
+                <w:sz w:val="18"/>
               </w:rPr>
-              <w:t>Validar montos, evitar pagos duplicados y registrar hash.</w:t>
+              <w:t>Crear un ticket desde la conversación.</w:t>
             </w:r>
           </w:p>
         </w:tc>
@@ -2126,11 +2088,9 @@
             </w:pPr>
             <w:r>
               <w:rPr>
-                <w:rFonts w:ascii="Calibri" w:hAnsi="Calibri"/>
-                <w:color w:val="2D3748"/>
-                <w:sz w:val="17"/>
+                <w:sz w:val="18"/>
               </w:rPr>
-              <w:t>comprobante: hash_archivo UNIQUE, monto_ocr, confianza_ocr.</w:t>
+              <w:t>Caso de Uso M2; Secuencia Reclamo Técnico.</w:t>
             </w:r>
           </w:p>
         </w:tc>
@@ -2144,16 +2104,19 @@
             </w:pPr>
             <w:r>
               <w:rPr>
-                <w:rFonts w:ascii="Calibri" w:hAnsi="Calibri"/>
-                <w:color w:val="2D3748"/>
-                <w:sz w:val="17"/>
+                <w:sz w:val="18"/>
               </w:rPr>
-              <w:t>ServicioRegistroComprobanteWhatsapp / Comprobante</w:t>
+              <w:t>ServicioRegistroReclamoWhatsapp y Ticket; creación manual corresponde a RF-27.</w:t>
             </w:r>
           </w:p>
         </w:tc>
       </w:tr>
       <w:tr>
+        <w:trPr>
+          <w:cantSplit/>
+          <w:cantSplit/>
+          <w:cantSplit/>
+        </w:trPr>
         <w:tc>
           <w:tcPr>
             <w:tcW w:type="dxa" w:w="2340"/>
@@ -2165,12 +2128,9 @@
             </w:pPr>
             <w:r>
               <w:rPr>
-                <w:rFonts w:ascii="Calibri" w:hAnsi="Calibri"/>
-                <w:b/>
-                <w:color w:val="2D3748"/>
-                <w:sz w:val="17"/>
+                <w:sz w:val="18"/>
               </w:rPr>
-              <w:t>RF-15: Derivación y atención humana</w:t>
+              <w:t>RF-15: Toma de control humano</w:t>
             </w:r>
           </w:p>
         </w:tc>
@@ -2184,11 +2144,9 @@
             </w:pPr>
             <w:r>
               <w:rPr>
-                <w:rFonts w:ascii="Calibri" w:hAnsi="Calibri"/>
-                <w:color w:val="2D3748"/>
-                <w:sz w:val="17"/>
+                <w:sz w:val="18"/>
               </w:rPr>
-              <w:t>Escalar chats no resueltos o con fallos reiterados.</w:t>
+              <w:t>Permitir que empleado o administrador continúe cuando el bot no resuelve.</w:t>
             </w:r>
           </w:p>
         </w:tc>
@@ -2202,11 +2160,9 @@
             </w:pPr>
             <w:r>
               <w:rPr>
-                <w:rFonts w:ascii="Calibri" w:hAnsi="Calibri"/>
-                <w:color w:val="2D3748"/>
-                <w:sz w:val="17"/>
+                <w:sz w:val="18"/>
               </w:rPr>
-              <w:t>conversacion: id_usuario_atencion, modo_atencion.</w:t>
+              <w:t>Caso de Uso M2; Secuencia Atención Humana.</w:t>
             </w:r>
           </w:p>
         </w:tc>
@@ -2220,16 +2176,19 @@
             </w:pPr>
             <w:r>
               <w:rPr>
-                <w:rFonts w:ascii="Calibri" w:hAnsi="Calibri"/>
-                <w:color w:val="2D3748"/>
-                <w:sz w:val="17"/>
+                <w:sz w:val="18"/>
               </w:rPr>
-              <w:t>ServicioAtencionHumanaWhatsapp</w:t>
+              <w:t>ServicioAtencionHumanaWhatsapp; toma exclusiva y autorización comprobadas.</w:t>
             </w:r>
           </w:p>
         </w:tc>
       </w:tr>
       <w:tr>
+        <w:trPr>
+          <w:cantSplit/>
+          <w:cantSplit/>
+          <w:cantSplit/>
+        </w:trPr>
         <w:tc>
           <w:tcPr>
             <w:tcW w:type="dxa" w:w="2340"/>
@@ -2241,12 +2200,9 @@
             </w:pPr>
             <w:r>
               <w:rPr>
-                <w:rFonts w:ascii="Calibri" w:hAnsi="Calibri"/>
-                <w:b/>
-                <w:color w:val="2D3748"/>
-                <w:sz w:val="17"/>
+                <w:sz w:val="18"/>
               </w:rPr>
-              <w:t>RF-16: Registro de reclamos técnicos</w:t>
+              <w:t>RF-16: Historial de mensajes</w:t>
             </w:r>
           </w:p>
         </w:tc>
@@ -2260,11 +2216,9 @@
             </w:pPr>
             <w:r>
               <w:rPr>
-                <w:rFonts w:ascii="Calibri" w:hAnsi="Calibri"/>
-                <w:color w:val="2D3748"/>
-                <w:sz w:val="17"/>
+                <w:sz w:val="18"/>
               </w:rPr>
-              <w:t>Vincular el reclamo originado en WhatsApp a un servicio.</w:t>
+              <w:t>Conservar fecha/hora, contenido, tipo y emisor.</w:t>
             </w:r>
           </w:p>
         </w:tc>
@@ -2278,11 +2232,9 @@
             </w:pPr>
             <w:r>
               <w:rPr>
-                <w:rFonts w:ascii="Calibri" w:hAnsi="Calibri"/>
-                <w:color w:val="2D3748"/>
-                <w:sz w:val="17"/>
+                <w:sz w:val="18"/>
               </w:rPr>
-              <w:t>ticket: id_conversacion, id_servicio, id_empleado.</w:t>
+              <w:t>Caso de Uso M2 y secuencias de recepción, reclamo y atención.</w:t>
             </w:r>
           </w:p>
         </w:tc>
@@ -2296,16 +2248,19 @@
             </w:pPr>
             <w:r>
               <w:rPr>
-                <w:rFonts w:ascii="Calibri" w:hAnsi="Calibri"/>
-                <w:color w:val="2D3748"/>
-                <w:sz w:val="17"/>
+                <w:sz w:val="18"/>
               </w:rPr>
-              <w:t>ServicioRegistroReclamoWhatsapp / Ticket</w:t>
+              <w:t>Modelo Mensaje y detalle de conversación; cubre tipos admitidos por la integración.</w:t>
             </w:r>
           </w:p>
         </w:tc>
       </w:tr>
       <w:tr>
+        <w:trPr>
+          <w:cantSplit/>
+          <w:cantSplit/>
+          <w:cantSplit/>
+        </w:trPr>
         <w:tc>
           <w:tcPr>
             <w:tcW w:type="dxa" w:w="2340"/>
@@ -2317,12 +2272,9 @@
             </w:pPr>
             <w:r>
               <w:rPr>
-                <w:rFonts w:ascii="Calibri" w:hAnsi="Calibri"/>
-                <w:b/>
-                <w:color w:val="2D3748"/>
-                <w:sz w:val="17"/>
+                <w:sz w:val="18"/>
               </w:rPr>
-              <w:t>RF-17 y RF-18: Avisos de vencimiento</w:t>
+              <w:t>RF-17: Cierre de conversación</w:t>
             </w:r>
           </w:p>
         </w:tc>
@@ -2336,11 +2288,9 @@
             </w:pPr>
             <w:r>
               <w:rPr>
-                <w:rFonts w:ascii="Calibri" w:hAnsi="Calibri"/>
-                <w:color w:val="2D3748"/>
-                <w:sz w:val="17"/>
+                <w:sz w:val="18"/>
               </w:rPr>
-              <w:t>Enviar notificaciones preventivas y de mora auditables.</w:t>
+              <w:t>Cerrar al resolver con el bot o al terminar atención humana.</w:t>
             </w:r>
           </w:p>
         </w:tc>
@@ -2354,11 +2304,9 @@
             </w:pPr>
             <w:r>
               <w:rPr>
-                <w:rFonts w:ascii="Calibri" w:hAnsi="Calibri"/>
-                <w:color w:val="2D3748"/>
-                <w:sz w:val="17"/>
+                <w:sz w:val="18"/>
               </w:rPr>
-              <w:t>Nueva entidad AvisoVencimiento (1:N con cuota).</w:t>
+              <w:t>Caso de Uso M2; secuencias de consulta, reclamo y atención.</w:t>
             </w:r>
           </w:p>
         </w:tc>
@@ -2372,11 +2320,80 @@
             </w:pPr>
             <w:r>
               <w:rPr>
-                <w:rFonts w:ascii="Calibri" w:hAnsi="Calibri"/>
-                <w:color w:val="2D3748"/>
-                <w:sz w:val="17"/>
+                <w:sz w:val="18"/>
               </w:rPr>
-              <w:t>ServicioAvisosVencimiento / AvisoVencimiento</w:t>
+              <w:t>ServicioConversaciones::cerrar; conserva historial y bloquea nuevos mensajes.</w:t>
+            </w:r>
+          </w:p>
+        </w:tc>
+      </w:tr>
+      <w:tr>
+        <w:trPr>
+          <w:cantSplit/>
+          <w:cantSplit/>
+          <w:cantSplit/>
+        </w:trPr>
+        <w:tc>
+          <w:tcPr>
+            <w:tcW w:type="dxa" w:w="2340"/>
+          </w:tcPr>
+          <w:p>
+            <w:pPr>
+              <w:spacing w:after="40"/>
+            </w:pPr>
+            <w:r>
+              <w:rPr>
+                <w:sz w:val="18"/>
+              </w:rPr>
+              <w:t>RF-18: Aviso de vencimientos por WhatsApp</w:t>
+            </w:r>
+          </w:p>
+        </w:tc>
+        <w:tc>
+          <w:tcPr>
+            <w:tcW w:type="dxa" w:w="2340"/>
+          </w:tcPr>
+          <w:p>
+            <w:pPr>
+              <w:spacing w:after="40"/>
+            </w:pPr>
+            <w:r>
+              <w:rPr>
+                <w:sz w:val="18"/>
+              </w:rPr>
+              <w:t>Notificar servicios próximos a vencer o ya vencidos.</w:t>
+            </w:r>
+          </w:p>
+        </w:tc>
+        <w:tc>
+          <w:tcPr>
+            <w:tcW w:type="dxa" w:w="2340"/>
+          </w:tcPr>
+          <w:p>
+            <w:pPr>
+              <w:spacing w:after="40"/>
+            </w:pPr>
+            <w:r>
+              <w:rPr>
+                <w:sz w:val="18"/>
+              </w:rPr>
+              <w:t>Caso de Uso M2; Secuencia Avisos de Vencimiento.</w:t>
+            </w:r>
+          </w:p>
+        </w:tc>
+        <w:tc>
+          <w:tcPr>
+            <w:tcW w:type="dxa" w:w="2340"/>
+          </w:tcPr>
+          <w:p>
+            <w:pPr>
+              <w:spacing w:after="40"/>
+            </w:pPr>
+            <w:r>
+              <w:rPr>
+                <w:sz w:val="18"/>
+              </w:rPr>
+              <w:t>ServicioAvisosVencimiento; ejecución diaria requiere activo el scheduler de Laravel.</w:t>
             </w:r>
           </w:p>
         </w:tc>
@@ -2390,6 +2407,7 @@
     <w:p>
       <w:pPr>
         <w:keepNext/>
+        <w:pageBreakBefore/>
         <w:spacing w:before="320" w:after="120"/>
       </w:pPr>
       <w:r>
@@ -2413,7 +2431,6 @@
           <w:color w:val="2D3748"/>
           <w:sz w:val="22"/>
         </w:rPr>
-        <w:t xml:space="preserve">• </w:t>
       </w:r>
       <w:r>
         <w:rPr>
@@ -2430,22 +2447,7 @@
         <w:spacing w:before="0" w:after="100" w:line="276" w:lineRule="auto"/>
       </w:pPr>
       <w:r>
-        <w:rPr>
-          <w:rFonts w:ascii="Calibri" w:hAnsi="Calibri"/>
-          <w:b/>
-          <w:color w:val="2D3748"/>
-          <w:sz w:val="22"/>
-        </w:rPr>
-        <w:t xml:space="preserve">• </w:t>
-      </w:r>
-      <w:r>
-        <w:rPr>
-          <w:rFonts w:ascii="Calibri" w:hAnsi="Calibri"/>
-          <w:i w:val="0"/>
-          <w:color w:val="2D3748"/>
-          <w:sz w:val="22"/>
-        </w:rPr>
-        <w:t>2. Integridad y Coherencia del Sistema: Todos los diagramas (.drawio) del proyecto reflejan con exactitud el dominio del problema y se encuentran en total sincronía con las migraciones, modelos Eloquent y servicios de negocio desarrollados.</w:t>
+        <w:t>2. Integridad y Coherencia del Sistema: corregimos la matriz de trazabilidad para que la numeración coincida con el Informe del Sistema. Las ocho fuentes del Módulo 2 y los diagramas generales revisados aún deben pasar la inspección visual y la exportación de PNG.</w:t>
       </w:r>
     </w:p>
     <w:p>
@@ -2453,22 +2455,7 @@
         <w:spacing w:before="0" w:after="100" w:line="276" w:lineRule="auto"/>
       </w:pPr>
       <w:r>
-        <w:rPr>
-          <w:rFonts w:ascii="Calibri" w:hAnsi="Calibri"/>
-          <w:b/>
-          <w:color w:val="2D3748"/>
-          <w:sz w:val="22"/>
-        </w:rPr>
-        <w:t xml:space="preserve">• </w:t>
-      </w:r>
-      <w:r>
-        <w:rPr>
-          <w:rFonts w:ascii="Calibri" w:hAnsi="Calibri"/>
-          <w:i w:val="0"/>
-          <w:color w:val="2D3748"/>
-          <w:sz w:val="22"/>
-        </w:rPr>
-        <w:t>3. Base Sólida para el Módulo 3: Al dejar correctamente normalizadas y documentadas las entidades Comprobante, Pago y CuentaReceptora con sus restricciones de hash y unicidad, el sistema queda técnicamente preparado para la implementación exhaustiva del pipeline OCR de comprobantes en el Módulo 3.</w:t>
+        <w:t>3. Preparación para el trabajo de comprobantes: el esquema contiene campos para OCR y unicidad, pero el código todavía no calcula el hash ni implementa OCR y conciliación. Esos comportamientos deben diseñarse contra RF-20 a RF-26 antes de considerarlos terminados.</w:t>
       </w:r>
     </w:p>
     <w:sectPr>

</xml_diff>